<commit_message>
Customer data generation for bronze layer
</commit_message>
<xml_diff>
--- a/docs/RETAIL SALES LAKEHOUSE PLATFORM.docx
+++ b/docs/RETAIL SALES LAKEHOUSE PLATFORM.docx
@@ -574,6 +574,586 @@
           <w:lang w:val="en-IN"/>
         </w:rPr>
         <w:t>Power BI / Azure SQL</w:t>
+      </w:r>
+    </w:p>
+    <w:p>
+      <w:pPr>
+        <w:jc w:val="center"/>
+        <w:rPr>
+          <w:b/>
+          <w:bCs/>
+          <w:lang w:val="en-IN"/>
+        </w:rPr>
+      </w:pPr>
+    </w:p>
+    <w:p>
+      <w:pPr>
+        <w:jc w:val="center"/>
+        <w:rPr>
+          <w:b/>
+          <w:bCs/>
+          <w:lang w:val="en-IN"/>
+        </w:rPr>
+      </w:pPr>
+    </w:p>
+    <w:p>
+      <w:pPr>
+        <w:jc w:val="center"/>
+        <w:rPr>
+          <w:b/>
+          <w:bCs/>
+          <w:lang w:val="en-IN"/>
+        </w:rPr>
+      </w:pPr>
+    </w:p>
+    <w:p>
+      <w:pPr>
+        <w:jc w:val="center"/>
+        <w:rPr>
+          <w:b/>
+          <w:bCs/>
+          <w:lang w:val="en-IN"/>
+        </w:rPr>
+      </w:pPr>
+    </w:p>
+    <w:p>
+      <w:pPr>
+        <w:jc w:val="center"/>
+        <w:rPr>
+          <w:b/>
+          <w:bCs/>
+          <w:lang w:val="en-IN"/>
+        </w:rPr>
+      </w:pPr>
+    </w:p>
+    <w:p>
+      <w:pPr>
+        <w:jc w:val="center"/>
+        <w:rPr>
+          <w:b/>
+          <w:bCs/>
+          <w:lang w:val="en-IN"/>
+        </w:rPr>
+      </w:pPr>
+    </w:p>
+    <w:p>
+      <w:pPr>
+        <w:jc w:val="center"/>
+        <w:rPr>
+          <w:b/>
+          <w:bCs/>
+          <w:lang w:val="en-IN"/>
+        </w:rPr>
+      </w:pPr>
+    </w:p>
+    <w:p>
+      <w:pPr>
+        <w:jc w:val="center"/>
+        <w:rPr>
+          <w:b/>
+          <w:bCs/>
+          <w:lang w:val="en-IN"/>
+        </w:rPr>
+      </w:pPr>
+    </w:p>
+    <w:p>
+      <w:pPr>
+        <w:jc w:val="center"/>
+        <w:rPr>
+          <w:b/>
+          <w:bCs/>
+          <w:lang w:val="en-IN"/>
+        </w:rPr>
+      </w:pPr>
+    </w:p>
+    <w:p>
+      <w:pPr>
+        <w:rPr>
+          <w:b/>
+          <w:bCs/>
+          <w:lang w:val="en-IN"/>
+        </w:rPr>
+      </w:pPr>
+      <w:r>
+        <w:rPr>
+          <w:b/>
+          <w:bCs/>
+          <w:lang w:val="en-IN"/>
+        </w:rPr>
+        <w:lastRenderedPageBreak/>
+        <w:t>=========================================</w:t>
+      </w:r>
+    </w:p>
+    <w:p>
+      <w:pPr>
+        <w:rPr>
+          <w:b/>
+          <w:bCs/>
+          <w:lang w:val="en-IN"/>
+        </w:rPr>
+      </w:pPr>
+      <w:r>
+        <w:rPr>
+          <w:b/>
+          <w:bCs/>
+          <w:lang w:val="en-IN"/>
+        </w:rPr>
+        <w:t>CUSTOMER DATA QUALITY REPORT</w:t>
+      </w:r>
+    </w:p>
+    <w:p>
+      <w:pPr>
+        <w:rPr>
+          <w:b/>
+          <w:bCs/>
+          <w:lang w:val="en-IN"/>
+        </w:rPr>
+      </w:pPr>
+      <w:r>
+        <w:rPr>
+          <w:b/>
+          <w:bCs/>
+          <w:lang w:val="en-IN"/>
+        </w:rPr>
+        <w:t>=========================================</w:t>
+      </w:r>
+    </w:p>
+    <w:p>
+      <w:pPr>
+        <w:rPr>
+          <w:b/>
+          <w:bCs/>
+          <w:lang w:val="en-IN"/>
+        </w:rPr>
+      </w:pPr>
+    </w:p>
+    <w:p>
+      <w:pPr>
+        <w:rPr>
+          <w:b/>
+          <w:bCs/>
+          <w:lang w:val="en-IN"/>
+        </w:rPr>
+      </w:pPr>
+      <w:r>
+        <w:rPr>
+          <w:b/>
+          <w:bCs/>
+          <w:lang w:val="en-IN"/>
+        </w:rPr>
+        <w:t xml:space="preserve">Records Read             </w:t>
+      </w:r>
+      <w:proofErr w:type="gramStart"/>
+      <w:r>
+        <w:rPr>
+          <w:b/>
+          <w:bCs/>
+          <w:lang w:val="en-IN"/>
+        </w:rPr>
+        <w:t xml:space="preserve">  :</w:t>
+      </w:r>
+      <w:proofErr w:type="gramEnd"/>
+      <w:r>
+        <w:rPr>
+          <w:b/>
+          <w:bCs/>
+          <w:lang w:val="en-IN"/>
+        </w:rPr>
+        <w:t xml:space="preserve"> 1000</w:t>
+      </w:r>
+    </w:p>
+    <w:p>
+      <w:pPr>
+        <w:rPr>
+          <w:b/>
+          <w:bCs/>
+          <w:lang w:val="en-IN"/>
+        </w:rPr>
+      </w:pPr>
+      <w:r>
+        <w:rPr>
+          <w:b/>
+          <w:bCs/>
+          <w:lang w:val="en-IN"/>
+        </w:rPr>
+        <w:t xml:space="preserve">Records Passed           </w:t>
+      </w:r>
+      <w:proofErr w:type="gramStart"/>
+      <w:r>
+        <w:rPr>
+          <w:b/>
+          <w:bCs/>
+          <w:lang w:val="en-IN"/>
+        </w:rPr>
+        <w:t xml:space="preserve">  :</w:t>
+      </w:r>
+      <w:proofErr w:type="gramEnd"/>
+      <w:r>
+        <w:rPr>
+          <w:b/>
+          <w:bCs/>
+          <w:lang w:val="en-IN"/>
+        </w:rPr>
+        <w:t xml:space="preserve"> 301</w:t>
+      </w:r>
+    </w:p>
+    <w:p>
+      <w:pPr>
+        <w:rPr>
+          <w:b/>
+          <w:bCs/>
+          <w:lang w:val="en-IN"/>
+        </w:rPr>
+      </w:pPr>
+      <w:r>
+        <w:rPr>
+          <w:b/>
+          <w:bCs/>
+          <w:lang w:val="en-IN"/>
+        </w:rPr>
+        <w:t xml:space="preserve">Records Failed           </w:t>
+      </w:r>
+      <w:proofErr w:type="gramStart"/>
+      <w:r>
+        <w:rPr>
+          <w:b/>
+          <w:bCs/>
+          <w:lang w:val="en-IN"/>
+        </w:rPr>
+        <w:t xml:space="preserve">  :</w:t>
+      </w:r>
+      <w:proofErr w:type="gramEnd"/>
+      <w:r>
+        <w:rPr>
+          <w:b/>
+          <w:bCs/>
+          <w:lang w:val="en-IN"/>
+        </w:rPr>
+        <w:t xml:space="preserve"> 699</w:t>
+      </w:r>
+    </w:p>
+    <w:p>
+      <w:pPr>
+        <w:rPr>
+          <w:b/>
+          <w:bCs/>
+          <w:lang w:val="en-IN"/>
+        </w:rPr>
+      </w:pPr>
+    </w:p>
+    <w:p>
+      <w:pPr>
+        <w:rPr>
+          <w:b/>
+          <w:bCs/>
+          <w:lang w:val="en-IN"/>
+        </w:rPr>
+      </w:pPr>
+      <w:r>
+        <w:rPr>
+          <w:b/>
+          <w:bCs/>
+          <w:lang w:val="en-IN"/>
+        </w:rPr>
+        <w:t xml:space="preserve">Duplicate Customer IDs   </w:t>
+      </w:r>
+      <w:proofErr w:type="gramStart"/>
+      <w:r>
+        <w:rPr>
+          <w:b/>
+          <w:bCs/>
+          <w:lang w:val="en-IN"/>
+        </w:rPr>
+        <w:t xml:space="preserve">  :</w:t>
+      </w:r>
+      <w:proofErr w:type="gramEnd"/>
+      <w:r>
+        <w:rPr>
+          <w:b/>
+          <w:bCs/>
+          <w:lang w:val="en-IN"/>
+        </w:rPr>
+        <w:t xml:space="preserve"> 0</w:t>
+      </w:r>
+    </w:p>
+    <w:p>
+      <w:pPr>
+        <w:rPr>
+          <w:b/>
+          <w:bCs/>
+          <w:lang w:val="en-IN"/>
+        </w:rPr>
+      </w:pPr>
+      <w:r>
+        <w:rPr>
+          <w:b/>
+          <w:bCs/>
+          <w:lang w:val="en-IN"/>
+        </w:rPr>
+        <w:t xml:space="preserve">Duplicate Emails         </w:t>
+      </w:r>
+      <w:proofErr w:type="gramStart"/>
+      <w:r>
+        <w:rPr>
+          <w:b/>
+          <w:bCs/>
+          <w:lang w:val="en-IN"/>
+        </w:rPr>
+        <w:t xml:space="preserve">  :</w:t>
+      </w:r>
+      <w:proofErr w:type="gramEnd"/>
+      <w:r>
+        <w:rPr>
+          <w:b/>
+          <w:bCs/>
+          <w:lang w:val="en-IN"/>
+        </w:rPr>
+        <w:t xml:space="preserve"> 1</w:t>
+      </w:r>
+    </w:p>
+    <w:p>
+      <w:pPr>
+        <w:rPr>
+          <w:b/>
+          <w:bCs/>
+          <w:lang w:val="en-IN"/>
+        </w:rPr>
+      </w:pPr>
+      <w:r>
+        <w:rPr>
+          <w:b/>
+          <w:bCs/>
+          <w:lang w:val="en-IN"/>
+        </w:rPr>
+        <w:t xml:space="preserve">Null Customer IDs        </w:t>
+      </w:r>
+      <w:proofErr w:type="gramStart"/>
+      <w:r>
+        <w:rPr>
+          <w:b/>
+          <w:bCs/>
+          <w:lang w:val="en-IN"/>
+        </w:rPr>
+        <w:t xml:space="preserve">  :</w:t>
+      </w:r>
+      <w:proofErr w:type="gramEnd"/>
+      <w:r>
+        <w:rPr>
+          <w:b/>
+          <w:bCs/>
+          <w:lang w:val="en-IN"/>
+        </w:rPr>
+        <w:t xml:space="preserve"> 0</w:t>
+      </w:r>
+    </w:p>
+    <w:p>
+      <w:pPr>
+        <w:rPr>
+          <w:b/>
+          <w:bCs/>
+          <w:lang w:val="en-IN"/>
+        </w:rPr>
+      </w:pPr>
+      <w:r>
+        <w:rPr>
+          <w:b/>
+          <w:bCs/>
+          <w:lang w:val="en-IN"/>
+        </w:rPr>
+        <w:t xml:space="preserve">Null Emails              </w:t>
+      </w:r>
+      <w:proofErr w:type="gramStart"/>
+      <w:r>
+        <w:rPr>
+          <w:b/>
+          <w:bCs/>
+          <w:lang w:val="en-IN"/>
+        </w:rPr>
+        <w:t xml:space="preserve">  :</w:t>
+      </w:r>
+      <w:proofErr w:type="gramEnd"/>
+      <w:r>
+        <w:rPr>
+          <w:b/>
+          <w:bCs/>
+          <w:lang w:val="en-IN"/>
+        </w:rPr>
+        <w:t xml:space="preserve"> 0</w:t>
+      </w:r>
+    </w:p>
+    <w:p>
+      <w:pPr>
+        <w:rPr>
+          <w:b/>
+          <w:bCs/>
+          <w:lang w:val="en-IN"/>
+        </w:rPr>
+      </w:pPr>
+      <w:r>
+        <w:rPr>
+          <w:b/>
+          <w:bCs/>
+          <w:lang w:val="en-IN"/>
+        </w:rPr>
+        <w:t xml:space="preserve">Invalid Gender           </w:t>
+      </w:r>
+      <w:proofErr w:type="gramStart"/>
+      <w:r>
+        <w:rPr>
+          <w:b/>
+          <w:bCs/>
+          <w:lang w:val="en-IN"/>
+        </w:rPr>
+        <w:t xml:space="preserve">  :</w:t>
+      </w:r>
+      <w:proofErr w:type="gramEnd"/>
+      <w:r>
+        <w:rPr>
+          <w:b/>
+          <w:bCs/>
+          <w:lang w:val="en-IN"/>
+        </w:rPr>
+        <w:t xml:space="preserve"> 0</w:t>
+      </w:r>
+    </w:p>
+    <w:p>
+      <w:pPr>
+        <w:rPr>
+          <w:b/>
+          <w:bCs/>
+          <w:lang w:val="en-IN"/>
+        </w:rPr>
+      </w:pPr>
+      <w:r>
+        <w:rPr>
+          <w:b/>
+          <w:bCs/>
+          <w:lang w:val="en-IN"/>
+        </w:rPr>
+        <w:t xml:space="preserve">Future Registration </w:t>
+      </w:r>
+      <w:proofErr w:type="gramStart"/>
+      <w:r>
+        <w:rPr>
+          <w:b/>
+          <w:bCs/>
+          <w:lang w:val="en-IN"/>
+        </w:rPr>
+        <w:t>Dates  :</w:t>
+      </w:r>
+      <w:proofErr w:type="gramEnd"/>
+      <w:r>
+        <w:rPr>
+          <w:b/>
+          <w:bCs/>
+          <w:lang w:val="en-IN"/>
+        </w:rPr>
+        <w:t xml:space="preserve"> 0</w:t>
+      </w:r>
+    </w:p>
+    <w:p>
+      <w:pPr>
+        <w:rPr>
+          <w:b/>
+          <w:bCs/>
+          <w:lang w:val="en-IN"/>
+        </w:rPr>
+      </w:pPr>
+      <w:r>
+        <w:rPr>
+          <w:b/>
+          <w:bCs/>
+          <w:lang w:val="en-IN"/>
+        </w:rPr>
+        <w:t xml:space="preserve">Invalid Phone Numbers    </w:t>
+      </w:r>
+      <w:proofErr w:type="gramStart"/>
+      <w:r>
+        <w:rPr>
+          <w:b/>
+          <w:bCs/>
+          <w:lang w:val="en-IN"/>
+        </w:rPr>
+        <w:t xml:space="preserve">  :</w:t>
+      </w:r>
+      <w:proofErr w:type="gramEnd"/>
+      <w:r>
+        <w:rPr>
+          <w:b/>
+          <w:bCs/>
+          <w:lang w:val="en-IN"/>
+        </w:rPr>
+        <w:t xml:space="preserve"> 698</w:t>
+      </w:r>
+    </w:p>
+    <w:p>
+      <w:pPr>
+        <w:rPr>
+          <w:b/>
+          <w:bCs/>
+          <w:lang w:val="en-IN"/>
+        </w:rPr>
+      </w:pPr>
+    </w:p>
+    <w:p>
+      <w:pPr>
+        <w:rPr>
+          <w:b/>
+          <w:bCs/>
+          <w:lang w:val="en-IN"/>
+        </w:rPr>
+      </w:pPr>
+      <w:r>
+        <w:rPr>
+          <w:b/>
+          <w:bCs/>
+          <w:lang w:val="en-IN"/>
+        </w:rPr>
+        <w:t xml:space="preserve">Overall Status           </w:t>
+      </w:r>
+      <w:proofErr w:type="gramStart"/>
+      <w:r>
+        <w:rPr>
+          <w:b/>
+          <w:bCs/>
+          <w:lang w:val="en-IN"/>
+        </w:rPr>
+        <w:t xml:space="preserve">  :</w:t>
+      </w:r>
+      <w:proofErr w:type="gramEnd"/>
+      <w:r>
+        <w:rPr>
+          <w:b/>
+          <w:bCs/>
+          <w:lang w:val="en-IN"/>
+        </w:rPr>
+        <w:t xml:space="preserve"> FAILED</w:t>
+      </w:r>
+    </w:p>
+    <w:p>
+      <w:pPr>
+        <w:rPr>
+          <w:b/>
+          <w:bCs/>
+          <w:lang w:val="en-IN"/>
+        </w:rPr>
+      </w:pPr>
+    </w:p>
+    <w:p>
+      <w:pPr>
+        <w:rPr>
+          <w:b/>
+          <w:bCs/>
+          <w:lang w:val="en-IN"/>
+        </w:rPr>
+      </w:pPr>
+      <w:r>
+        <w:rPr>
+          <w:b/>
+          <w:bCs/>
+          <w:lang w:val="en-IN"/>
+        </w:rPr>
+        <w:t>=========================================</w:t>
       </w:r>
     </w:p>
     <w:sectPr>
@@ -1650,6 +2230,7 @@
   <w:style w:type="character" w:default="1" w:styleId="DefaultParagraphFont">
     <w:name w:val="Default Paragraph Font"/>
     <w:uiPriority w:val="1"/>
+    <w:semiHidden/>
     <w:unhideWhenUsed/>
   </w:style>
   <w:style w:type="table" w:default="1" w:styleId="TableNormal">

</xml_diff>